<commit_message>
Project title and Introdution
</commit_message>
<xml_diff>
--- a/CA1StrategicThinking.docx
+++ b/CA1StrategicThinking.docx
@@ -2776,191 +2776,16 @@
           <w:szCs w:val="24"/>
           <w:u w:val="single"/>
         </w:rPr>
-        <w:t>Ensure that any content written in red is removed from the document before submission.</w:t>
-      </w:r>
-    </w:p>
-    <w:p>
-      <w:pPr>
-        <w:rPr>
-          <w:color w:val="FF0000"/>
-          <w:sz w:val="32"/>
-          <w:szCs w:val="32"/>
-        </w:rPr>
-      </w:pPr>
-    </w:p>
-    <w:p>
-      <w:pPr>
-        <w:rPr>
-          <w:color w:val="FF0000"/>
-          <w:sz w:val="32"/>
-          <w:szCs w:val="32"/>
-        </w:rPr>
-      </w:pPr>
-    </w:p>
-    <w:p>
-      <w:pPr>
-        <w:rPr>
-          <w:color w:val="FF0000"/>
-          <w:sz w:val="32"/>
-          <w:szCs w:val="32"/>
-        </w:rPr>
-      </w:pPr>
-    </w:p>
-    <w:p>
-      <w:pPr>
-        <w:rPr>
-          <w:rFonts w:ascii="Aptos" w:eastAsia="Aptos" w:hAnsi="Aptos" w:cs="Aptos"/>
-          <w:b/>
-          <w:color w:val="FF0000"/>
-          <w:sz w:val="24"/>
-          <w:szCs w:val="24"/>
-          <w:u w:val="single"/>
-        </w:rPr>
-      </w:pPr>
-    </w:p>
-    <w:p>
-      <w:pPr>
-        <w:rPr>
-          <w:rFonts w:ascii="Aptos" w:eastAsia="Aptos" w:hAnsi="Aptos" w:cs="Aptos"/>
-          <w:b/>
-          <w:color w:val="FF0000"/>
-          <w:sz w:val="24"/>
-          <w:szCs w:val="24"/>
-          <w:u w:val="single"/>
-        </w:rPr>
-      </w:pPr>
-    </w:p>
-    <w:p>
-      <w:pPr>
-        <w:rPr>
-          <w:rFonts w:ascii="Aptos" w:eastAsia="Aptos" w:hAnsi="Aptos" w:cs="Aptos"/>
-          <w:b/>
-          <w:color w:val="FF0000"/>
-          <w:sz w:val="24"/>
-          <w:szCs w:val="24"/>
-          <w:u w:val="single"/>
-        </w:rPr>
-      </w:pPr>
-    </w:p>
-    <w:p>
-      <w:pPr>
-        <w:rPr>
-          <w:rFonts w:ascii="Aptos" w:eastAsia="Aptos" w:hAnsi="Aptos" w:cs="Aptos"/>
-          <w:b/>
-          <w:color w:val="FF0000"/>
-          <w:sz w:val="24"/>
-          <w:szCs w:val="24"/>
-          <w:u w:val="single"/>
-        </w:rPr>
-      </w:pPr>
-    </w:p>
-    <w:p>
-      <w:pPr>
-        <w:rPr>
-          <w:color w:val="FF0000"/>
-          <w:sz w:val="32"/>
-          <w:szCs w:val="32"/>
-        </w:rPr>
-      </w:pPr>
-    </w:p>
-    <w:p>
-      <w:pPr>
-        <w:rPr>
-          <w:color w:val="FF0000"/>
-          <w:sz w:val="32"/>
-          <w:szCs w:val="32"/>
-        </w:rPr>
-      </w:pPr>
-    </w:p>
-    <w:p>
-      <w:pPr>
-        <w:rPr>
-          <w:color w:val="FF0000"/>
-          <w:sz w:val="32"/>
-          <w:szCs w:val="32"/>
-        </w:rPr>
-      </w:pPr>
-    </w:p>
-    <w:p>
-      <w:pPr>
-        <w:rPr>
-          <w:color w:val="FF0000"/>
-          <w:sz w:val="32"/>
-          <w:szCs w:val="32"/>
-        </w:rPr>
-      </w:pPr>
-    </w:p>
-    <w:p>
-      <w:pPr>
-        <w:rPr>
-          <w:color w:val="FF0000"/>
-          <w:sz w:val="32"/>
-          <w:szCs w:val="32"/>
-        </w:rPr>
-      </w:pPr>
-    </w:p>
-    <w:p>
-      <w:pPr>
-        <w:rPr>
-          <w:color w:val="3A3A3A"/>
-          <w:sz w:val="40"/>
-          <w:szCs w:val="40"/>
-        </w:rPr>
-      </w:pPr>
-      <w:r>
-        <w:rPr>
-          <w:color w:val="3A3A3A"/>
-          <w:sz w:val="40"/>
-          <w:szCs w:val="40"/>
-        </w:rPr>
-        <w:lastRenderedPageBreak/>
-        <w:t>Abstract</w:t>
-      </w:r>
-    </w:p>
-    <w:p/>
-    <w:p>
-      <w:pPr>
-        <w:rPr>
-          <w:color w:val="FF0000"/>
-        </w:rPr>
-      </w:pPr>
-      <w:r>
-        <w:rPr>
-          <w:color w:val="FF0000"/>
-        </w:rPr>
-        <w:t xml:space="preserve">[NOTE: This section is designated for the abstract. Abstracts are not assigned page numbers and should precede the table of contents. If an abstract is unnecessary for your work, please delete this page.] </w:t>
-      </w:r>
-    </w:p>
-    <w:p>
-      <w:pPr>
-        <w:rPr>
-          <w:color w:val="FF0000"/>
-        </w:rPr>
-      </w:pPr>
-    </w:p>
-    <w:p>
-      <w:pPr>
-        <w:rPr>
-          <w:color w:val="FF0000"/>
-        </w:rPr>
-      </w:pPr>
-    </w:p>
-    <w:p>
-      <w:pPr>
-        <w:rPr>
-          <w:color w:val="FF0000"/>
-        </w:rPr>
-      </w:pPr>
-    </w:p>
-    <w:p/>
-    <w:p/>
-    <w:p/>
-    <w:p/>
-    <w:p/>
-    <w:p/>
-    <w:p/>
-    <w:p/>
-    <w:p/>
+        <w:t>Ensure that any content written in red is removed from the document before submissi</w:t>
+      </w:r>
+    </w:p>
+    <w:p>
+      <w:pPr>
+        <w:rPr>
+          <w:color w:val="FF0000"/>
+        </w:rPr>
+      </w:pPr>
+    </w:p>
     <w:p/>
     <w:p/>
     <w:p/>
@@ -3239,196 +3064,99 @@
       </w:pPr>
     </w:p>
     <w:p>
-      <w:pPr>
-        <w:pStyle w:val="Heading1"/>
-        <w:spacing w:after="0"/>
-      </w:pPr>
       <w:bookmarkStart w:id="16" w:name="_heading=h.gjdgxs" w:colFirst="0" w:colLast="0"/>
+      <w:bookmarkStart w:id="17" w:name="_heading=h.2et92p0" w:colFirst="0" w:colLast="0"/>
       <w:bookmarkEnd w:id="16"/>
+      <w:bookmarkEnd w:id="17"/>
       <w:r>
         <w:lastRenderedPageBreak/>
-        <w:t>Introduction</w:t>
-      </w:r>
-    </w:p>
-    <w:p>
-      <w:pPr>
-        <w:pStyle w:val="Heading1"/>
-        <w:spacing w:before="0"/>
-      </w:pPr>
-      <w:bookmarkStart w:id="17" w:name="_heading=h.30j0zll" w:colFirst="0" w:colLast="0"/>
-      <w:bookmarkEnd w:id="17"/>
-      <w:r>
-        <w:t>Chapter 1</w:t>
-      </w:r>
-    </w:p>
-    <w:p>
-      <w:pPr>
-        <w:pStyle w:val="Heading2"/>
-      </w:pPr>
-      <w:bookmarkStart w:id="18" w:name="_heading=h.1fob9te" w:colFirst="0" w:colLast="0"/>
-      <w:bookmarkEnd w:id="18"/>
-      <w:r>
-        <w:t>Chapter 1.1</w:t>
-      </w:r>
-    </w:p>
-    <w:p>
-      <w:pPr>
-        <w:pStyle w:val="Heading3"/>
-      </w:pPr>
-      <w:bookmarkStart w:id="19" w:name="_heading=h.3znysh7" w:colFirst="0" w:colLast="0"/>
-      <w:bookmarkEnd w:id="19"/>
-      <w:r>
-        <w:t>Chapter 1.1.1.</w:t>
+        <w:t>1. Project Title</w:t>
+      </w:r>
+    </w:p>
+    <w:p>
+      <w:r>
+        <w:t xml:space="preserve">Consumer shopping </w:t>
+      </w:r>
+      <w:r>
+        <w:t>behaviour evolution in Ireland</w:t>
       </w:r>
     </w:p>
     <w:p/>
     <w:p>
       <w:r>
-        <w:rPr>
-          <w:noProof/>
-        </w:rPr>
-        <w:drawing>
-          <wp:inline distT="0" distB="0" distL="0" distR="0" wp14:anchorId="3D568519" wp14:editId="3B3CDB16">
-            <wp:extent cx="3571875" cy="819150"/>
-            <wp:effectExtent l="0" t="0" r="0" b="0"/>
-            <wp:docPr id="1728545884" name="image2.png" descr="A screenshot of a computer&#10;&#10;Description automatically generated"/>
-            <wp:cNvGraphicFramePr/>
-            <a:graphic xmlns:a="http://schemas.openxmlformats.org/drawingml/2006/main">
-              <a:graphicData uri="http://schemas.openxmlformats.org/drawingml/2006/picture">
-                <pic:pic xmlns:pic="http://schemas.openxmlformats.org/drawingml/2006/picture">
-                  <pic:nvPicPr>
-                    <pic:cNvPr id="0" name="image2.png" descr="A screenshot of a computer&#10;&#10;Description automatically generated"/>
-                    <pic:cNvPicPr preferRelativeResize="0"/>
-                  </pic:nvPicPr>
-                  <pic:blipFill>
-                    <a:blip r:embed="rId15"/>
-                    <a:srcRect/>
-                    <a:stretch>
-                      <a:fillRect/>
-                    </a:stretch>
-                  </pic:blipFill>
-                  <pic:spPr>
-                    <a:xfrm>
-                      <a:off x="0" y="0"/>
-                      <a:ext cx="3571875" cy="819150"/>
-                    </a:xfrm>
-                    <a:prstGeom prst="rect">
-                      <a:avLst/>
-                    </a:prstGeom>
-                    <a:ln/>
-                  </pic:spPr>
-                </pic:pic>
-              </a:graphicData>
-            </a:graphic>
-          </wp:inline>
-        </w:drawing>
-      </w:r>
-    </w:p>
-    <w:p>
-      <w:pPr>
-        <w:rPr>
-          <w:color w:val="FF0000"/>
-        </w:rPr>
-      </w:pPr>
-    </w:p>
-    <w:p>
-      <w:pPr>
-        <w:rPr>
-          <w:color w:val="FF0000"/>
-        </w:rPr>
-      </w:pPr>
-      <w:r>
-        <w:rPr>
-          <w:color w:val="FF0000"/>
-        </w:rPr>
-        <w:t>[NOTE: For the table of contents to function properly, you must use the correct headings for all your chapters and subchapters.</w:t>
-      </w:r>
-    </w:p>
-    <w:p>
-      <w:pPr>
-        <w:rPr>
-          <w:color w:val="FF0000"/>
-        </w:rPr>
-      </w:pPr>
-      <w:r>
-        <w:rPr>
-          <w:b/>
-          <w:color w:val="FF0000"/>
-        </w:rPr>
-        <w:t>Heading 1:</w:t>
-      </w:r>
-      <w:r>
-        <w:rPr>
-          <w:color w:val="FF0000"/>
-        </w:rPr>
-        <w:t xml:space="preserve"> This is the main heading and should be employed for the primary title or chapter. For example: CHAPTER 1.</w:t>
-      </w:r>
-    </w:p>
-    <w:p>
-      <w:pPr>
-        <w:rPr>
-          <w:color w:val="FF0000"/>
-        </w:rPr>
-      </w:pPr>
-      <w:r>
-        <w:rPr>
-          <w:b/>
-          <w:color w:val="FF0000"/>
-        </w:rPr>
-        <w:t>Heading 2:</w:t>
-      </w:r>
-      <w:r>
-        <w:rPr>
-          <w:color w:val="FF0000"/>
-        </w:rPr>
-        <w:t xml:space="preserve"> Use Heading 2 as a subheading. For instance: Chapter 1.1.</w:t>
-      </w:r>
-    </w:p>
-    <w:p>
-      <w:pPr>
-        <w:rPr>
-          <w:color w:val="FF0000"/>
-        </w:rPr>
-      </w:pPr>
-      <w:r>
-        <w:rPr>
-          <w:b/>
-          <w:color w:val="FF0000"/>
-        </w:rPr>
-        <w:t>Heading 3:</w:t>
-      </w:r>
-      <w:r>
-        <w:rPr>
-          <w:color w:val="FF0000"/>
-        </w:rPr>
-        <w:t xml:space="preserve"> Heading 3 provides a more detailed breakdown, such as Chapter 1.1.1.</w:t>
-      </w:r>
-    </w:p>
-    <w:p>
-      <w:pPr>
-        <w:rPr>
-          <w:color w:val="FF0000"/>
-        </w:rPr>
-      </w:pPr>
-      <w:r>
-        <w:rPr>
-          <w:color w:val="FF0000"/>
-        </w:rPr>
-        <w:t>By adhering to this hierarchical structure, you ensure an organized and effective document outline, enhancing readability and navigation. However, you are not forced to use all 3 headings, usually heading 1 and 2 are sufficient.</w:t>
-      </w:r>
-    </w:p>
-    <w:p>
-      <w:pPr>
-        <w:rPr>
-          <w:color w:val="FF0000"/>
-        </w:rPr>
-      </w:pPr>
-      <w:r>
-        <w:rPr>
-          <w:color w:val="FF0000"/>
-        </w:rPr>
-        <w:t>The remainder of your text should be written using a normal font.]</w:t>
-      </w:r>
+        <w:t>2. Introduction</w:t>
+      </w:r>
+    </w:p>
+    <w:p>
+      <w:pPr>
+        <w:spacing w:after="100" w:line="276" w:lineRule="auto"/>
+        <w:rPr>
+          <w:rFonts w:ascii="Aptos" w:eastAsia="MS Mincho" w:hAnsi="Aptos" w:cs="Times New Roman"/>
+          <w:sz w:val="20"/>
+          <w:lang w:val="en-US" w:eastAsia="en-US"/>
+        </w:rPr>
+      </w:pPr>
+      <w:r>
+        <w:rPr>
+          <w:rFonts w:ascii="Aptos" w:eastAsia="MS Mincho" w:hAnsi="Aptos" w:cs="Times New Roman"/>
+          <w:sz w:val="20"/>
+          <w:lang w:val="en-US" w:eastAsia="en-US"/>
+        </w:rPr>
+        <w:t>There have been changes in how customers look for goods, price them and buy them because of digital commerce. For Irish businesses, it is no longer a case of just looking at whether online commerce is increasing or not; rather, it is about understanding the relationship between digital activity and physical activity in retail and the implications for investments that will have to be made in the future. A business can get advantage from online searching, click-and-collect and face-to-face selling all at once. Therefore, both online and offline marketing activities should not be considered contradictory without justification.</w:t>
+      </w:r>
+    </w:p>
+    <w:p>
+      <w:pPr>
+        <w:spacing w:after="100" w:line="276" w:lineRule="auto"/>
+        <w:rPr>
+          <w:rFonts w:ascii="Aptos" w:eastAsia="MS Mincho" w:hAnsi="Aptos" w:cs="Times New Roman"/>
+          <w:sz w:val="20"/>
+          <w:lang w:val="en-US" w:eastAsia="en-US"/>
+        </w:rPr>
+      </w:pPr>
+      <w:r>
+        <w:rPr>
+          <w:rFonts w:ascii="Aptos" w:eastAsia="MS Mincho" w:hAnsi="Aptos" w:cs="Times New Roman"/>
+          <w:sz w:val="20"/>
+          <w:lang w:val="en-US" w:eastAsia="en-US"/>
+        </w:rPr>
+        <w:t>The analysis and subsequent prediction will focus on observable shifts in the pattern of Irish retail and e-commerce activity. This study can be used to make business decisions regarding resource allocation and digital readiness. The entire project will take two semesters, and this is the proposed approach to the project, not a report on its findings.</w:t>
+      </w:r>
+    </w:p>
+    <w:p>
+      <w:pPr>
+        <w:spacing w:after="100" w:line="276" w:lineRule="auto"/>
+        <w:rPr>
+          <w:rFonts w:ascii="Aptos" w:eastAsia="MS Mincho" w:hAnsi="Aptos" w:cs="Times New Roman"/>
+          <w:sz w:val="20"/>
+          <w:lang w:val="en-US" w:eastAsia="en-US"/>
+        </w:rPr>
+      </w:pPr>
+    </w:p>
+    <w:p>
+      <w:pPr>
+        <w:spacing w:after="100" w:line="276" w:lineRule="auto"/>
+        <w:rPr>
+          <w:rFonts w:ascii="Aptos" w:eastAsia="MS Mincho" w:hAnsi="Aptos" w:cs="Times New Roman"/>
+          <w:sz w:val="20"/>
+          <w:lang w:val="en-US" w:eastAsia="en-US"/>
+        </w:rPr>
+      </w:pPr>
+      <w:r>
+        <w:rPr>
+          <w:rFonts w:ascii="Aptos" w:eastAsia="MS Mincho" w:hAnsi="Aptos" w:cs="Times New Roman"/>
+          <w:sz w:val="20"/>
+          <w:lang w:val="en-US" w:eastAsia="en-US"/>
+        </w:rPr>
+        <w:t>3. Problem Definition</w:t>
+      </w:r>
+    </w:p>
+    <w:p>
+      <w:pPr>
+        <w:rPr>
+          <w:lang w:val="en-US"/>
+        </w:rPr>
+      </w:pPr>
     </w:p>
     <w:p/>
     <w:p/>
@@ -3440,32 +3168,20 @@
     <w:p/>
     <w:p/>
     <w:p/>
-    <w:p/>
-    <w:p/>
-    <w:p>
-      <w:pPr>
-        <w:pStyle w:val="Heading1"/>
-      </w:pPr>
-      <w:bookmarkStart w:id="20" w:name="_heading=h.2et92p0" w:colFirst="0" w:colLast="0"/>
-      <w:bookmarkEnd w:id="20"/>
-      <w:r>
-        <w:lastRenderedPageBreak/>
-        <w:t>References</w:t>
-      </w:r>
-    </w:p>
-    <w:p/>
-    <w:p>
-      <w:pPr>
-        <w:rPr>
-          <w:color w:val="FF0000"/>
-        </w:rPr>
-      </w:pPr>
-      <w:r>
-        <w:rPr>
-          <w:color w:val="FF0000"/>
-        </w:rPr>
-        <w:t>Please list all the references you have used in your assignment alphabetically and in the Harvard style. You can find information on how to correctly reference in Harvard at this link: https://library.cct.ie/referencing/harvard</w:t>
-      </w:r>
+    <w:p>
+      <w:pPr>
+        <w:pBdr>
+          <w:top w:val="nil"/>
+          <w:left w:val="nil"/>
+          <w:bottom w:val="nil"/>
+          <w:right w:val="nil"/>
+          <w:between w:val="nil"/>
+        </w:pBdr>
+        <w:spacing w:after="0" w:line="240" w:lineRule="auto"/>
+        <w:rPr>
+          <w:color w:val="000000"/>
+        </w:rPr>
+      </w:pPr>
     </w:p>
     <w:p/>
     <w:p/>
@@ -3477,44 +3193,12 @@
     <w:p/>
     <w:p/>
     <w:p/>
-    <w:p/>
-    <w:p/>
-    <w:p/>
-    <w:p/>
-    <w:p/>
-    <w:p/>
-    <w:p/>
-    <w:p>
-      <w:pPr>
-        <w:pBdr>
-          <w:top w:val="nil"/>
-          <w:left w:val="nil"/>
-          <w:bottom w:val="nil"/>
-          <w:right w:val="nil"/>
-          <w:between w:val="nil"/>
-        </w:pBdr>
-        <w:spacing w:after="0" w:line="240" w:lineRule="auto"/>
-        <w:rPr>
-          <w:color w:val="000000"/>
-        </w:rPr>
-      </w:pPr>
-    </w:p>
-    <w:p/>
-    <w:p/>
-    <w:p/>
-    <w:p/>
-    <w:p/>
-    <w:p/>
-    <w:p/>
-    <w:p/>
-    <w:p/>
-    <w:p/>
     <w:p>
       <w:pPr>
         <w:pStyle w:val="Heading1"/>
       </w:pPr>
-      <w:bookmarkStart w:id="21" w:name="_heading=h.kfkjs3rwl2c1" w:colFirst="0" w:colLast="0"/>
-      <w:bookmarkEnd w:id="21"/>
+      <w:bookmarkStart w:id="18" w:name="_heading=h.kfkjs3rwl2c1" w:colFirst="0" w:colLast="0"/>
+      <w:bookmarkEnd w:id="18"/>
       <w:r>
         <w:t>Appendix</w:t>
       </w:r>
@@ -3575,7 +3259,7 @@
     </w:p>
     <w:p/>
     <w:sectPr>
-      <w:footerReference w:type="default" r:id="rId16"/>
+      <w:footerReference w:type="default" r:id="rId15"/>
       <w:pgSz w:w="11906" w:h="16838"/>
       <w:pgMar w:top="1440" w:right="1440" w:bottom="1440" w:left="1440" w:header="708" w:footer="708" w:gutter="0"/>
       <w:pgNumType w:start="1"/>
@@ -4405,7 +4089,7 @@
   <w:abstractNum w:abstractNumId="5" w15:restartNumberingAfterBreak="0">
     <w:nsid w:val="7A490A53"/>
     <w:multiLevelType w:val="multilevel"/>
-    <w:tmpl w:val="9EA23756"/>
+    <w:tmpl w:val="4294BA5E"/>
     <w:lvl w:ilvl="0">
       <w:start w:val="1"/>
       <w:numFmt w:val="bullet"/>
@@ -4422,20 +4106,16 @@
         <w:sz w:val="20"/>
       </w:rPr>
     </w:lvl>
-    <w:lvl w:ilvl="1" w:tentative="1">
+    <w:lvl w:ilvl="1">
       <w:start w:val="1"/>
-      <w:numFmt w:val="bullet"/>
-      <w:lvlText w:val="o"/>
+      <w:numFmt w:val="decimal"/>
+      <w:lvlText w:val="%2."/>
       <w:lvlJc w:val="left"/>
       <w:pPr>
-        <w:tabs>
-          <w:tab w:val="num" w:pos="1440"/>
-        </w:tabs>
         <w:ind w:left="1440" w:hanging="360"/>
       </w:pPr>
       <w:rPr>
-        <w:rFonts w:ascii="Courier New" w:hAnsi="Courier New" w:hint="default"/>
-        <w:sz w:val="20"/>
+        <w:rFonts w:hint="default"/>
       </w:rPr>
     </w:lvl>
     <w:lvl w:ilvl="2" w:tentative="1">

</xml_diff>